<commit_message>
Enhance numbered architecture diagram, flowchart and update docx/pptx
</commit_message>
<xml_diff>
--- a/docs/Proposal_AI_Air_Doctor.docx
+++ b/docs/Proposal_AI_Air_Doctor.docx
@@ -3583,7 +3583,7 @@
       <w:r>
         <w:drawing>
           <wp:inline xmlns:a="http://schemas.openxmlformats.org/drawingml/2006/main" xmlns:pic="http://schemas.openxmlformats.org/drawingml/2006/picture">
-            <wp:extent cx="5580000" cy="2870102"/>
+            <wp:extent cx="5580000" cy="2924443"/>
             <wp:docPr id="1" name="Picture 1"/>
             <wp:cNvGraphicFramePr>
               <a:graphicFrameLocks noChangeAspect="1"/>
@@ -3604,7 +3604,7 @@
                   <pic:spPr>
                     <a:xfrm>
                       <a:off x="0" y="0"/>
-                      <a:ext cx="5580000" cy="2870102"/>
+                      <a:ext cx="5580000" cy="2924443"/>
                     </a:xfrm>
                     <a:prstGeom prst="rect"/>
                   </pic:spPr>
@@ -3658,7 +3658,7 @@
       <w:r>
         <w:drawing>
           <wp:inline xmlns:a="http://schemas.openxmlformats.org/drawingml/2006/main" xmlns:pic="http://schemas.openxmlformats.org/drawingml/2006/picture">
-            <wp:extent cx="3960000" cy="5210091"/>
+            <wp:extent cx="3960000" cy="4887242"/>
             <wp:docPr id="2" name="Picture 2"/>
             <wp:cNvGraphicFramePr>
               <a:graphicFrameLocks noChangeAspect="1"/>
@@ -3679,7 +3679,7 @@
                   <pic:spPr>
                     <a:xfrm>
                       <a:off x="0" y="0"/>
-                      <a:ext cx="3960000" cy="5210091"/>
+                      <a:ext cx="3960000" cy="4887242"/>
                     </a:xfrm>
                     <a:prstGeom prst="rect"/>
                   </pic:spPr>

</xml_diff>

<commit_message>
Add team member info: 7115093066 Yang, 7115093063 Hsu, 7115064183 Hsieh, 7115064202 Tan
</commit_message>
<xml_diff>
--- a/docs/Proposal_AI_Air_Doctor.docx
+++ b/docs/Proposal_AI_Air_Doctor.docx
@@ -36,7 +36,7 @@
           <w:rFonts w:ascii="Microsoft JhengHei" w:hAnsi="Microsoft JhengHei" w:eastAsia="Microsoft JhengHei"/>
           <w:sz w:val="22"/>
         </w:rPr>
-        <w:t>組員：______、______、______、______</w:t>
+        <w:t>組員：楊禾睿（7115093066）、徐崇皓（7115093063）、謝秉樺（7115064183）、譚人傑（7115064202）</w:t>
       </w:r>
     </w:p>
     <w:p>
@@ -48,7 +48,7 @@
           <w:rFonts w:ascii="Microsoft JhengHei" w:hAnsi="Microsoft JhengHei" w:eastAsia="Microsoft JhengHei"/>
           <w:sz w:val="22"/>
         </w:rPr>
-        <w:t>課程：物聯網與智慧系統應用專題  指導老師：______</w:t>
+        <w:t>課程：物聯網與智慧系統應用專題  指導老師：教授</w:t>
       </w:r>
     </w:p>
     <w:p>

</xml_diff>

<commit_message>
Update exact student ID format: 7115093066_Yang, 7115093063_Hsu, 7115064183_Hsieh, 7115064202_Tan across all documents, docx and pptx
</commit_message>
<xml_diff>
--- a/docs/Proposal_AI_Air_Doctor.docx
+++ b/docs/Proposal_AI_Air_Doctor.docx
@@ -36,7 +36,7 @@
           <w:rFonts w:ascii="Microsoft JhengHei" w:hAnsi="Microsoft JhengHei" w:eastAsia="Microsoft JhengHei"/>
           <w:sz w:val="22"/>
         </w:rPr>
-        <w:t>組員：楊禾睿（7115093066）、徐崇皓（7115093063）、謝秉樺（7115064183）、譚人傑（7115064202）</w:t>
+        <w:t>組員：7115093066_楊禾睿、7115093063_徐崇皓、7115064183_謝秉樺、7115064202_譚人傑</w:t>
       </w:r>
     </w:p>
     <w:p>
@@ -48,7 +48,7 @@
           <w:rFonts w:ascii="Microsoft JhengHei" w:hAnsi="Microsoft JhengHei" w:eastAsia="Microsoft JhengHei"/>
           <w:sz w:val="22"/>
         </w:rPr>
-        <w:t>課程：物聯網與智慧系統應用專題  指導老師：教授</w:t>
+        <w:t>課程：物聯網與智慧系統應用專題  指導老師：授課教授</w:t>
       </w:r>
     </w:p>
     <w:p>

</xml_diff>